<commit_message>
docs: update SRS documentation for week 7
</commit_message>
<xml_diff>
--- a/documentation/CSE4204-8D-T01 SRS.docx
+++ b/documentation/CSE4204-8D-T01 SRS.docx
@@ -1944,9 +1944,17 @@
     </w:tbl>
     <w:p>
       <w:pPr>
-        <w:spacing w:before="360" w:after="160"/>
+        <w:pStyle w:val="ListBullet"/>
+        <w:numPr>
+          <w:ilvl w:val="0"/>
+          <w:numId w:val="0"/>
+        </w:numPr>
+        <w:spacing w:after="240"/>
         <w:rPr>
           <w:rFonts w:ascii="Times New Roman" w:hAnsi="Times New Roman" w:cs="Times New Roman"/>
+          <w:i/>
+          <w:color w:val="4A5568"/>
+          <w:sz w:val="21"/>
         </w:rPr>
       </w:pPr>
     </w:p>
@@ -1958,9 +1966,11 @@
           <w:numId w:val="0"/>
         </w:numPr>
         <w:spacing w:after="240"/>
-        <w:ind w:left="360"/>
         <w:rPr>
           <w:rFonts w:ascii="Times New Roman" w:hAnsi="Times New Roman" w:cs="Times New Roman"/>
+          <w:i/>
+          <w:color w:val="4A5568"/>
+          <w:sz w:val="21"/>
         </w:rPr>
       </w:pPr>
       <w:r>
@@ -1970,7 +1980,7 @@
           <w:color w:val="4A5568"/>
           <w:sz w:val="21"/>
         </w:rPr>
-        <w:t xml:space="preserve">                                                    </w:t>
+        <w:t xml:space="preserve">                                                   </w:t>
       </w:r>
       <w:r>
         <w:rPr>
@@ -1981,6 +1991,312 @@
         </w:rPr>
         <w:t>Figure 1: System Use Case Diagram Layout</w:t>
       </w:r>
+    </w:p>
+    <w:p>
+      <w:pPr>
+        <w:rPr>
+          <w:rFonts w:ascii="Times New Roman" w:hAnsi="Times New Roman" w:cs="Times New Roman"/>
+          <w:i/>
+          <w:color w:val="4A5568"/>
+          <w:sz w:val="21"/>
+        </w:rPr>
+      </w:pPr>
+    </w:p>
+    <w:p>
+      <w:pPr>
+        <w:rPr>
+          <w:rFonts w:ascii="Times New Roman" w:hAnsi="Times New Roman" w:cs="Times New Roman"/>
+          <w:i/>
+          <w:color w:val="auto"/>
+          <w:sz w:val="21"/>
+        </w:rPr>
+      </w:pPr>
+    </w:p>
+    <w:p>
+      <w:pPr>
+        <w:rPr>
+          <w:rFonts w:ascii="Times New Roman" w:hAnsi="Times New Roman" w:cs="Times New Roman"/>
+          <w:b/>
+          <w:bCs/>
+          <w:iCs/>
+          <w:color w:val="auto"/>
+          <w:sz w:val="24"/>
+          <w:szCs w:val="24"/>
+        </w:rPr>
+      </w:pPr>
+    </w:p>
+    <w:p>
+      <w:pPr>
+        <w:rPr>
+          <w:rFonts w:ascii="Times New Roman" w:hAnsi="Times New Roman" w:cs="Times New Roman"/>
+          <w:b/>
+          <w:bCs/>
+          <w:iCs/>
+          <w:color w:val="auto"/>
+          <w:sz w:val="24"/>
+          <w:szCs w:val="24"/>
+        </w:rPr>
+      </w:pPr>
+    </w:p>
+    <w:p>
+      <w:pPr>
+        <w:rPr>
+          <w:rFonts w:ascii="Times New Roman" w:hAnsi="Times New Roman" w:cs="Times New Roman"/>
+          <w:b/>
+          <w:bCs/>
+          <w:iCs/>
+          <w:color w:val="auto"/>
+          <w:sz w:val="24"/>
+          <w:szCs w:val="24"/>
+        </w:rPr>
+      </w:pPr>
+    </w:p>
+    <w:p>
+      <w:pPr>
+        <w:rPr>
+          <w:rFonts w:ascii="Times New Roman" w:hAnsi="Times New Roman" w:cs="Times New Roman"/>
+          <w:b/>
+          <w:bCs/>
+          <w:iCs/>
+          <w:color w:val="auto"/>
+          <w:sz w:val="24"/>
+          <w:szCs w:val="24"/>
+        </w:rPr>
+      </w:pPr>
+    </w:p>
+    <w:p>
+      <w:pPr>
+        <w:rPr>
+          <w:rFonts w:ascii="Times New Roman" w:hAnsi="Times New Roman" w:cs="Times New Roman"/>
+          <w:b/>
+          <w:bCs/>
+          <w:iCs/>
+          <w:color w:val="auto"/>
+          <w:sz w:val="24"/>
+          <w:szCs w:val="24"/>
+        </w:rPr>
+      </w:pPr>
+    </w:p>
+    <w:p>
+      <w:pPr>
+        <w:rPr>
+          <w:rFonts w:ascii="Times New Roman" w:hAnsi="Times New Roman" w:cs="Times New Roman"/>
+          <w:b/>
+          <w:bCs/>
+          <w:iCs/>
+          <w:color w:val="auto"/>
+          <w:sz w:val="24"/>
+          <w:szCs w:val="24"/>
+        </w:rPr>
+      </w:pPr>
+    </w:p>
+    <w:p>
+      <w:pPr>
+        <w:rPr>
+          <w:rFonts w:ascii="Times New Roman" w:hAnsi="Times New Roman" w:cs="Times New Roman"/>
+          <w:b/>
+          <w:bCs/>
+          <w:color w:val="auto"/>
+          <w:sz w:val="24"/>
+          <w:szCs w:val="24"/>
+        </w:rPr>
+      </w:pPr>
+      <w:r>
+        <w:rPr>
+          <w:rFonts w:ascii="Times New Roman" w:hAnsi="Times New Roman" w:cs="Times New Roman"/>
+          <w:b/>
+          <w:bCs/>
+          <w:iCs/>
+          <w:color w:val="auto"/>
+          <w:sz w:val="24"/>
+          <w:szCs w:val="24"/>
+        </w:rPr>
+        <w:lastRenderedPageBreak/>
+        <w:t>8</w:t>
+      </w:r>
+      <w:r>
+        <w:rPr>
+          <w:rFonts w:ascii="Times New Roman" w:hAnsi="Times New Roman" w:cs="Times New Roman"/>
+          <w:b/>
+          <w:bCs/>
+          <w:i/>
+          <w:color w:val="auto"/>
+          <w:sz w:val="24"/>
+          <w:szCs w:val="24"/>
+        </w:rPr>
+        <w:t xml:space="preserve">. </w:t>
+      </w:r>
+      <w:r>
+        <w:rPr>
+          <w:rFonts w:ascii="Times New Roman" w:hAnsi="Times New Roman" w:cs="Times New Roman"/>
+          <w:b/>
+          <w:bCs/>
+          <w:color w:val="auto"/>
+          <w:sz w:val="24"/>
+          <w:szCs w:val="24"/>
+        </w:rPr>
+        <w:t>ER Diagram</w:t>
+      </w:r>
+    </w:p>
+    <w:tbl>
+      <w:tblPr>
+        <w:tblStyle w:val="TableGrid"/>
+        <w:tblW w:w="0" w:type="auto"/>
+        <w:tblLook w:val="04A0" w:firstRow="1" w:lastRow="0" w:firstColumn="1" w:lastColumn="0" w:noHBand="0" w:noVBand="1"/>
+      </w:tblPr>
+      <w:tblGrid>
+        <w:gridCol w:w="9576"/>
+      </w:tblGrid>
+      <w:tr>
+        <w:tc>
+          <w:tcPr>
+            <w:tcW w:w="9576" w:type="dxa"/>
+          </w:tcPr>
+          <w:p>
+            <w:pPr>
+              <w:rPr>
+                <w:rFonts w:ascii="Times New Roman" w:hAnsi="Times New Roman" w:cs="Times New Roman"/>
+                <w:b/>
+                <w:bCs/>
+                <w:color w:val="auto"/>
+                <w:sz w:val="24"/>
+                <w:szCs w:val="24"/>
+              </w:rPr>
+            </w:pPr>
+            <w:r>
+              <w:rPr>
+                <w:rFonts w:ascii="Times New Roman" w:hAnsi="Times New Roman" w:cs="Times New Roman"/>
+                <w:noProof/>
+              </w:rPr>
+              <w:drawing>
+                <wp:anchor distT="0" distB="0" distL="114300" distR="114300" simplePos="0" relativeHeight="251659264" behindDoc="0" locked="0" layoutInCell="1" allowOverlap="1" wp14:anchorId="5C485B81" wp14:editId="674D0DBC">
+                  <wp:simplePos x="0" y="0"/>
+                  <wp:positionH relativeFrom="column">
+                    <wp:posOffset>-69215</wp:posOffset>
+                  </wp:positionH>
+                  <wp:positionV relativeFrom="paragraph">
+                    <wp:posOffset>1905</wp:posOffset>
+                  </wp:positionV>
+                  <wp:extent cx="6064250" cy="5640070"/>
+                  <wp:effectExtent l="0" t="0" r="0" b="0"/>
+                  <wp:wrapTopAndBottom/>
+                  <wp:docPr id="5" name="Picture 5"/>
+                  <wp:cNvGraphicFramePr>
+                    <a:graphicFrameLocks xmlns:a="http://schemas.openxmlformats.org/drawingml/2006/main" noChangeAspect="1"/>
+                  </wp:cNvGraphicFramePr>
+                  <a:graphic xmlns:a="http://schemas.openxmlformats.org/drawingml/2006/main">
+                    <a:graphicData uri="http://schemas.openxmlformats.org/drawingml/2006/picture">
+                      <pic:pic xmlns:pic="http://schemas.openxmlformats.org/drawingml/2006/picture">
+                        <pic:nvPicPr>
+                          <pic:cNvPr id="1" name=""/>
+                          <pic:cNvPicPr/>
+                        </pic:nvPicPr>
+                        <pic:blipFill>
+                          <a:blip r:embed="rId7"/>
+                          <a:stretch>
+                            <a:fillRect/>
+                          </a:stretch>
+                        </pic:blipFill>
+                        <pic:spPr>
+                          <a:xfrm>
+                            <a:off x="0" y="0"/>
+                            <a:ext cx="6064250" cy="5640070"/>
+                          </a:xfrm>
+                          <a:prstGeom prst="rect">
+                            <a:avLst/>
+                          </a:prstGeom>
+                        </pic:spPr>
+                      </pic:pic>
+                    </a:graphicData>
+                  </a:graphic>
+                  <wp14:sizeRelH relativeFrom="margin">
+                    <wp14:pctWidth>0</wp14:pctWidth>
+                  </wp14:sizeRelH>
+                </wp:anchor>
+              </w:drawing>
+            </w:r>
+          </w:p>
+        </w:tc>
+      </w:tr>
+    </w:tbl>
+    <w:p>
+      <w:pPr>
+        <w:rPr>
+          <w:rFonts w:ascii="Times New Roman" w:hAnsi="Times New Roman" w:cs="Times New Roman"/>
+          <w:b/>
+          <w:bCs/>
+          <w:color w:val="auto"/>
+          <w:sz w:val="24"/>
+          <w:szCs w:val="24"/>
+        </w:rPr>
+      </w:pPr>
+    </w:p>
+    <w:p>
+      <w:pPr>
+        <w:pStyle w:val="ListBullet"/>
+        <w:numPr>
+          <w:ilvl w:val="0"/>
+          <w:numId w:val="0"/>
+        </w:numPr>
+        <w:spacing w:after="240"/>
+        <w:jc w:val="center"/>
+        <w:rPr>
+          <w:rFonts w:ascii="Times New Roman" w:hAnsi="Times New Roman" w:cs="Times New Roman"/>
+          <w:i/>
+          <w:color w:val="4A5568"/>
+          <w:sz w:val="21"/>
+        </w:rPr>
+      </w:pPr>
+      <w:r>
+        <w:rPr>
+          <w:rFonts w:ascii="Times New Roman" w:hAnsi="Times New Roman" w:cs="Times New Roman"/>
+          <w:i/>
+          <w:color w:val="4A5568"/>
+          <w:sz w:val="21"/>
+        </w:rPr>
+        <w:t xml:space="preserve">Figure </w:t>
+      </w:r>
+      <w:r>
+        <w:rPr>
+          <w:rFonts w:ascii="Times New Roman" w:hAnsi="Times New Roman" w:cs="Times New Roman"/>
+          <w:i/>
+          <w:color w:val="4A5568"/>
+          <w:sz w:val="21"/>
+        </w:rPr>
+        <w:t>2</w:t>
+      </w:r>
+      <w:r>
+        <w:rPr>
+          <w:rFonts w:ascii="Times New Roman" w:hAnsi="Times New Roman" w:cs="Times New Roman"/>
+          <w:i/>
+          <w:color w:val="404040" w:themeColor="text1" w:themeTint="BF"/>
+          <w:sz w:val="21"/>
+        </w:rPr>
+        <w:t xml:space="preserve">: </w:t>
+      </w:r>
+      <w:r>
+        <w:rPr>
+          <w:rFonts w:ascii="Times New Roman" w:hAnsi="Times New Roman" w:cs="Times New Roman"/>
+          <w:i/>
+          <w:iCs/>
+          <w:color w:val="404040" w:themeColor="text1" w:themeTint="BF"/>
+          <w:sz w:val="21"/>
+          <w:szCs w:val="21"/>
+        </w:rPr>
+        <w:t>ER Diagram</w:t>
+      </w:r>
+    </w:p>
+    <w:p>
+      <w:pPr>
+        <w:rPr>
+          <w:rFonts w:ascii="Times New Roman" w:hAnsi="Times New Roman" w:cs="Times New Roman"/>
+          <w:b/>
+          <w:bCs/>
+          <w:color w:val="auto"/>
+          <w:sz w:val="24"/>
+          <w:szCs w:val="24"/>
+        </w:rPr>
+      </w:pPr>
     </w:p>
     <w:sectPr>
       <w:pgSz w:w="12240" w:h="15840"/>
@@ -2147,7 +2463,7 @@
   <w:abstractNum w:abstractNumId="8" w15:restartNumberingAfterBreak="0">
     <w:nsid w:val="FFFFFF89"/>
     <w:multiLevelType w:val="singleLevel"/>
-    <w:tmpl w:val="ECB43C9A"/>
+    <w:tmpl w:val="32346E6E"/>
     <w:lvl w:ilvl="0">
       <w:start w:val="1"/>
       <w:numFmt w:val="bullet"/>
@@ -2802,7 +3118,6 @@
   <w:style w:type="character" w:default="1" w:styleId="DefaultParagraphFont">
     <w:name w:val="Default Paragraph Font"/>
     <w:uiPriority w:val="1"/>
-    <w:semiHidden/>
     <w:unhideWhenUsed/>
   </w:style>
   <w:style w:type="table" w:default="1" w:styleId="TableNormal">

</xml_diff>